<commit_message>
Acquimètre: Kit Qualiopi buyers' price retired (no sale): no Kit Qualiopi offer, code KITQ199, ?offre=kit link or kit-proof script on any page, CGV art. 4 single price, JSON-LD one offer; sample deliverables regenerated without the Kit Qualiopi references; test guards it
Co-Authored-By: Claude Opus 5.5 (1M context) <noreply@anthropic.com>
</commit_message>
<xml_diff>
--- a/samples/gestion-temps/output/acquimetre-evaluations-8-11-exemple-gestion-temps/C01-gestion-professionnelle-du-temps/C01-4-corriges-baremes-sources.docx
+++ b/samples/gestion-temps/output/acquimetre-evaluations-8-11-exemple-gestion-temps/C01-gestion-professionnelle-du-temps/C01-4-corriges-baremes-sources.docx
@@ -43,7 +43,7 @@
         <w:t xml:space="preserve">Version :</w:t>
       </w:r>
       <w:r>
-        <w:t xml:space="preserve"> commande exemple-gestion-temps, 16/10/2026</w:t>
+        <w:t xml:space="preserve"> commande exemple-gestion-temps, 18/10/2026</w:t>
       </w:r>
     </w:p>
     <w:p>
@@ -1222,7 +1222,7 @@
       <w:tblGrid>
         <w:gridCol w:w="2254"/>
         <w:gridCol w:w="2940"/>
-        <w:gridCol w:w="4606"/>
+        <w:gridCol w:w="4704"/>
       </w:tblGrid>
       <w:tr>
         <w:trPr>
@@ -1274,7 +1274,7 @@
         </w:tc>
         <w:tc>
           <w:tcPr>
-            <w:tcW w:type="pct" w:w="2350"/>
+            <w:tcW w:type="pct" w:w="2400"/>
             <w:shd w:fill="1F4E79" w:color="auto" w:val="clear"/>
             <w:tcMar>
               <w:top w:type="dxa" w:w="60"/>
@@ -1330,7 +1330,7 @@
         </w:tc>
         <w:tc>
           <w:tcPr>
-            <w:tcW w:type="pct" w:w="2350"/>
+            <w:tcW w:type="pct" w:w="2400"/>
             <w:tcMar>
               <w:top w:type="dxa" w:w="60"/>
               <w:left w:type="dxa" w:w="80"/>
@@ -1380,7 +1380,7 @@
         </w:tc>
         <w:tc>
           <w:tcPr>
-            <w:tcW w:type="pct" w:w="2350"/>
+            <w:tcW w:type="pct" w:w="2400"/>
             <w:tcMar>
               <w:top w:type="dxa" w:w="60"/>
               <w:left w:type="dxa" w:w="80"/>
@@ -1430,7 +1430,7 @@
         </w:tc>
         <w:tc>
           <w:tcPr>
-            <w:tcW w:type="pct" w:w="2350"/>
+            <w:tcW w:type="pct" w:w="2400"/>
             <w:tcMar>
               <w:top w:type="dxa" w:w="60"/>
               <w:left w:type="dxa" w:w="80"/>
@@ -1480,17 +1480,17 @@
         </w:tc>
         <w:tc>
           <w:tcPr>
-            <w:tcW w:type="pct" w:w="2350"/>
-            <w:tcMar>
-              <w:top w:type="dxa" w:w="60"/>
-              <w:left w:type="dxa" w:w="80"/>
-              <w:bottom w:type="dxa" w:w="60"/>
-              <w:right w:type="dxa" w:w="80"/>
-            </w:tcMar>
-          </w:tcPr>
-          <w:p>
-            <w:r>
-              <w:t xml:space="preserve">Fiche T34 du Kit Qualiopi ou votre propre procédure</w:t>
+            <w:tcW w:type="pct" w:w="2400"/>
+            <w:tcMar>
+              <w:top w:type="dxa" w:w="60"/>
+              <w:left w:type="dxa" w:w="80"/>
+              <w:bottom w:type="dxa" w:w="60"/>
+              <w:right w:type="dxa" w:w="80"/>
+            </w:tcMar>
+          </w:tcPr>
+          <w:p>
+            <w:r>
+              <w:t xml:space="preserve">Votre procédure d’accueil des personnes en situation de handicap</w:t>
             </w:r>
           </w:p>
         </w:tc>

</xml_diff>